<commit_message>
Implement Phase L: CTB/CTS Stabilized Pavement Module with safety warnings and indicative comparison
</commit_message>
<xml_diff>
--- a/build/smoke_report.docx
+++ b/build/smoke_report.docx
@@ -40,7 +40,7 @@
           <w:b w:val="0"/>
           <w:sz w:val="20"/>
         </w:rPr>
-        <w:t>Pavement Laboratory  •  Report Date: 15-May-2026</w:t>
+        <w:t>Pavement Laboratory  •  Report Date: 23-Jun-2026</w:t>
       </w:r>
     </w:p>
     <w:p>
@@ -482,7 +482,7 @@
                 <w:b w:val="0"/>
                 <w:sz w:val="20"/>
               </w:rPr>
-              <w:t>0.0</w:t>
+              <w:t>50.0</w:t>
             </w:r>
           </w:p>
         </w:tc>
@@ -501,7 +501,7 @@
                 <w:b w:val="0"/>
                 <w:sz w:val="20"/>
               </w:rPr>
-              <w:t>0.0</w:t>
+              <w:t>50.0</w:t>
             </w:r>
           </w:p>
         </w:tc>
@@ -520,7 +520,7 @@
                 <w:b w:val="0"/>
                 <w:sz w:val="20"/>
               </w:rPr>
-              <w:t>0.0</w:t>
+              <w:t>50.0</w:t>
             </w:r>
           </w:p>
         </w:tc>
@@ -539,7 +539,7 @@
                 <w:b w:val="0"/>
                 <w:sz w:val="20"/>
               </w:rPr>
-              <w:t>0.0</w:t>
+              <w:t>50.0</w:t>
             </w:r>
           </w:p>
         </w:tc>
@@ -558,7 +558,7 @@
                 <w:b w:val="0"/>
                 <w:sz w:val="20"/>
               </w:rPr>
-              <w:t>0.0</w:t>
+              <w:t>50.0</w:t>
             </w:r>
           </w:p>
         </w:tc>
@@ -598,7 +598,7 @@
                 <w:b w:val="0"/>
                 <w:sz w:val="20"/>
               </w:rPr>
-              <w:t>0.0</w:t>
+              <w:t>50.0</w:t>
             </w:r>
           </w:p>
         </w:tc>
@@ -617,7 +617,7 @@
                 <w:b w:val="0"/>
                 <w:sz w:val="20"/>
               </w:rPr>
-              <w:t>0.0</w:t>
+              <w:t>50.0</w:t>
             </w:r>
           </w:p>
         </w:tc>
@@ -636,7 +636,7 @@
                 <w:b w:val="0"/>
                 <w:sz w:val="20"/>
               </w:rPr>
-              <w:t>0.0</w:t>
+              <w:t>50.0</w:t>
             </w:r>
           </w:p>
         </w:tc>
@@ -655,7 +655,7 @@
                 <w:b w:val="0"/>
                 <w:sz w:val="20"/>
               </w:rPr>
-              <w:t>0.0</w:t>
+              <w:t>50.0</w:t>
             </w:r>
           </w:p>
         </w:tc>
@@ -674,7 +674,7 @@
                 <w:b w:val="0"/>
                 <w:sz w:val="20"/>
               </w:rPr>
-              <w:t>0.0</w:t>
+              <w:t>50.0</w:t>
             </w:r>
           </w:p>
         </w:tc>
@@ -714,7 +714,7 @@
                 <w:b w:val="0"/>
                 <w:sz w:val="20"/>
               </w:rPr>
-              <w:t>0.0</w:t>
+              <w:t>50.0</w:t>
             </w:r>
           </w:p>
         </w:tc>
@@ -733,7 +733,7 @@
                 <w:b w:val="0"/>
                 <w:sz w:val="20"/>
               </w:rPr>
-              <w:t>0.0</w:t>
+              <w:t>50.0</w:t>
             </w:r>
           </w:p>
         </w:tc>
@@ -752,7 +752,7 @@
                 <w:b w:val="0"/>
                 <w:sz w:val="20"/>
               </w:rPr>
-              <w:t>0.0</w:t>
+              <w:t>50.0</w:t>
             </w:r>
           </w:p>
         </w:tc>
@@ -771,7 +771,7 @@
                 <w:b w:val="0"/>
                 <w:sz w:val="20"/>
               </w:rPr>
-              <w:t>0.0</w:t>
+              <w:t>50.0</w:t>
             </w:r>
           </w:p>
         </w:tc>
@@ -790,7 +790,7 @@
                 <w:b w:val="0"/>
                 <w:sz w:val="20"/>
               </w:rPr>
-              <w:t>0.0</w:t>
+              <w:t>50.0</w:t>
             </w:r>
           </w:p>
         </w:tc>
@@ -830,7 +830,7 @@
                 <w:b w:val="0"/>
                 <w:sz w:val="20"/>
               </w:rPr>
-              <w:t>0.0</w:t>
+              <w:t>50.0</w:t>
             </w:r>
           </w:p>
         </w:tc>
@@ -849,7 +849,7 @@
                 <w:b w:val="0"/>
                 <w:sz w:val="20"/>
               </w:rPr>
-              <w:t>0.0</w:t>
+              <w:t>50.0</w:t>
             </w:r>
           </w:p>
         </w:tc>
@@ -868,7 +868,7 @@
                 <w:b w:val="0"/>
                 <w:sz w:val="20"/>
               </w:rPr>
-              <w:t>0.0</w:t>
+              <w:t>50.0</w:t>
             </w:r>
           </w:p>
         </w:tc>
@@ -887,7 +887,7 @@
                 <w:b w:val="0"/>
                 <w:sz w:val="20"/>
               </w:rPr>
-              <w:t>0.0</w:t>
+              <w:t>50.0</w:t>
             </w:r>
           </w:p>
         </w:tc>
@@ -906,7 +906,7 @@
                 <w:b w:val="0"/>
                 <w:sz w:val="20"/>
               </w:rPr>
-              <w:t>0.0</w:t>
+              <w:t>50.0</w:t>
             </w:r>
           </w:p>
         </w:tc>
@@ -946,7 +946,7 @@
                 <w:b w:val="0"/>
                 <w:sz w:val="20"/>
               </w:rPr>
-              <w:t>0.0</w:t>
+              <w:t>50.0</w:t>
             </w:r>
           </w:p>
         </w:tc>
@@ -965,7 +965,7 @@
                 <w:b w:val="0"/>
                 <w:sz w:val="20"/>
               </w:rPr>
-              <w:t>0.0</w:t>
+              <w:t>50.0</w:t>
             </w:r>
           </w:p>
         </w:tc>
@@ -984,7 +984,7 @@
                 <w:b w:val="0"/>
                 <w:sz w:val="20"/>
               </w:rPr>
-              <w:t>0.0</w:t>
+              <w:t>50.0</w:t>
             </w:r>
           </w:p>
         </w:tc>
@@ -1003,7 +1003,7 @@
                 <w:b w:val="0"/>
                 <w:sz w:val="20"/>
               </w:rPr>
-              <w:t>0.0</w:t>
+              <w:t>50.0</w:t>
             </w:r>
           </w:p>
         </w:tc>
@@ -1022,7 +1022,7 @@
                 <w:b w:val="0"/>
                 <w:sz w:val="20"/>
               </w:rPr>
-              <w:t>0.0</w:t>
+              <w:t>50.0</w:t>
             </w:r>
           </w:p>
         </w:tc>
@@ -1062,7 +1062,7 @@
                 <w:b w:val="0"/>
                 <w:sz w:val="20"/>
               </w:rPr>
-              <w:t>0.0</w:t>
+              <w:t>50.0</w:t>
             </w:r>
           </w:p>
         </w:tc>
@@ -1081,7 +1081,7 @@
                 <w:b w:val="0"/>
                 <w:sz w:val="20"/>
               </w:rPr>
-              <w:t>0.0</w:t>
+              <w:t>50.0</w:t>
             </w:r>
           </w:p>
         </w:tc>
@@ -1100,7 +1100,7 @@
                 <w:b w:val="0"/>
                 <w:sz w:val="20"/>
               </w:rPr>
-              <w:t>0.0</w:t>
+              <w:t>50.0</w:t>
             </w:r>
           </w:p>
         </w:tc>
@@ -1119,7 +1119,7 @@
                 <w:b w:val="0"/>
                 <w:sz w:val="20"/>
               </w:rPr>
-              <w:t>0.0</w:t>
+              <w:t>50.0</w:t>
             </w:r>
           </w:p>
         </w:tc>
@@ -1138,7 +1138,7 @@
                 <w:b w:val="0"/>
                 <w:sz w:val="20"/>
               </w:rPr>
-              <w:t>0.0</w:t>
+              <w:t>50.0</w:t>
             </w:r>
           </w:p>
         </w:tc>
@@ -1178,7 +1178,7 @@
                 <w:b w:val="0"/>
                 <w:sz w:val="20"/>
               </w:rPr>
-              <w:t>0.0</w:t>
+              <w:t>50.0</w:t>
             </w:r>
           </w:p>
         </w:tc>
@@ -1197,7 +1197,7 @@
                 <w:b w:val="0"/>
                 <w:sz w:val="20"/>
               </w:rPr>
-              <w:t>0.0</w:t>
+              <w:t>50.0</w:t>
             </w:r>
           </w:p>
         </w:tc>
@@ -1216,7 +1216,7 @@
                 <w:b w:val="0"/>
                 <w:sz w:val="20"/>
               </w:rPr>
-              <w:t>0.0</w:t>
+              <w:t>50.0</w:t>
             </w:r>
           </w:p>
         </w:tc>
@@ -1235,7 +1235,7 @@
                 <w:b w:val="0"/>
                 <w:sz w:val="20"/>
               </w:rPr>
-              <w:t>0.0</w:t>
+              <w:t>50.0</w:t>
             </w:r>
           </w:p>
         </w:tc>
@@ -1254,7 +1254,7 @@
                 <w:b w:val="0"/>
                 <w:sz w:val="20"/>
               </w:rPr>
-              <w:t>0.0</w:t>
+              <w:t>50.0</w:t>
             </w:r>
           </w:p>
         </w:tc>
@@ -1294,7 +1294,7 @@
                 <w:b w:val="0"/>
                 <w:sz w:val="20"/>
               </w:rPr>
-              <w:t>0.0</w:t>
+              <w:t>50.0</w:t>
             </w:r>
           </w:p>
         </w:tc>
@@ -1313,7 +1313,7 @@
                 <w:b w:val="0"/>
                 <w:sz w:val="20"/>
               </w:rPr>
-              <w:t>0.0</w:t>
+              <w:t>50.0</w:t>
             </w:r>
           </w:p>
         </w:tc>
@@ -1332,7 +1332,7 @@
                 <w:b w:val="0"/>
                 <w:sz w:val="20"/>
               </w:rPr>
-              <w:t>0.0</w:t>
+              <w:t>50.0</w:t>
             </w:r>
           </w:p>
         </w:tc>
@@ -1351,7 +1351,7 @@
                 <w:b w:val="0"/>
                 <w:sz w:val="20"/>
               </w:rPr>
-              <w:t>0.0</w:t>
+              <w:t>50.0</w:t>
             </w:r>
           </w:p>
         </w:tc>
@@ -1370,7 +1370,7 @@
                 <w:b w:val="0"/>
                 <w:sz w:val="20"/>
               </w:rPr>
-              <w:t>0.0</w:t>
+              <w:t>50.0</w:t>
             </w:r>
           </w:p>
         </w:tc>
@@ -1622,6 +1622,46 @@
                 <w:b w:val="0"/>
                 <w:sz w:val="20"/>
               </w:rPr>
+              <w:t>Cement</w:t>
+            </w:r>
+          </w:p>
+        </w:tc>
+        <w:tc>
+          <w:tcPr>
+            <w:tcW w:type="dxa" w:w="4801"/>
+            <w:vAlign w:val="center"/>
+          </w:tcPr>
+          <w:p>
+            <w:pPr>
+              <w:jc w:val="center"/>
+            </w:pPr>
+            <w:r>
+              <w:rPr>
+                <w:rFonts w:ascii="Arial" w:hAnsi="Arial"/>
+                <w:b w:val="0"/>
+                <w:sz w:val="20"/>
+              </w:rPr>
+              <w:t>2.0%</w:t>
+            </w:r>
+          </w:p>
+        </w:tc>
+      </w:tr>
+      <w:tr>
+        <w:tc>
+          <w:tcPr>
+            <w:tcW w:type="dxa" w:w="4801"/>
+            <w:vAlign w:val="center"/>
+          </w:tcPr>
+          <w:p>
+            <w:pPr>
+              <w:jc w:val="left"/>
+            </w:pPr>
+            <w:r>
+              <w:rPr>
+                <w:rFonts w:ascii="Arial" w:hAnsi="Arial"/>
+                <w:b w:val="0"/>
+                <w:sz w:val="20"/>
+              </w:rPr>
               <w:t>TOTAL</w:t>
             </w:r>
           </w:p>
@@ -1641,7 +1681,7 @@
                 <w:b w:val="0"/>
                 <w:sz w:val="20"/>
               </w:rPr>
-              <w:t>98.0%</w:t>
+              <w:t>100.0%</w:t>
             </w:r>
           </w:p>
         </w:tc>
@@ -1809,7 +1849,7 @@
                 <w:b w:val="0"/>
                 <w:sz w:val="20"/>
               </w:rPr>
-              <w:t>0.00</w:t>
+              <w:t>50.00</w:t>
             </w:r>
           </w:p>
         </w:tc>
@@ -1887,7 +1927,7 @@
                 <w:b w:val="0"/>
                 <w:sz w:val="20"/>
               </w:rPr>
-              <w:t>0.00</w:t>
+              <w:t>50.00</w:t>
             </w:r>
           </w:p>
         </w:tc>
@@ -1965,7 +2005,7 @@
                 <w:b w:val="0"/>
                 <w:sz w:val="20"/>
               </w:rPr>
-              <w:t>0.00</w:t>
+              <w:t>50.00</w:t>
             </w:r>
           </w:p>
         </w:tc>
@@ -2043,7 +2083,7 @@
                 <w:b w:val="0"/>
                 <w:sz w:val="20"/>
               </w:rPr>
-              <w:t>0.00</w:t>
+              <w:t>50.00</w:t>
             </w:r>
           </w:p>
         </w:tc>
@@ -2121,7 +2161,7 @@
                 <w:b w:val="0"/>
                 <w:sz w:val="20"/>
               </w:rPr>
-              <w:t>0.00</w:t>
+              <w:t>50.00</w:t>
             </w:r>
           </w:p>
         </w:tc>
@@ -2159,7 +2199,7 @@
                 <w:b w:val="0"/>
                 <w:sz w:val="20"/>
               </w:rPr>
-              <w:t>Out</w:t>
+              <w:t>Within</w:t>
             </w:r>
           </w:p>
         </w:tc>
@@ -2199,7 +2239,7 @@
                 <w:b w:val="0"/>
                 <w:sz w:val="20"/>
               </w:rPr>
-              <w:t>0.00</w:t>
+              <w:t>50.00</w:t>
             </w:r>
           </w:p>
         </w:tc>
@@ -2277,7 +2317,7 @@
                 <w:b w:val="0"/>
                 <w:sz w:val="20"/>
               </w:rPr>
-              <w:t>0.00</w:t>
+              <w:t>50.00</w:t>
             </w:r>
           </w:p>
         </w:tc>
@@ -2355,7 +2395,7 @@
                 <w:b w:val="0"/>
                 <w:sz w:val="20"/>
               </w:rPr>
-              <w:t>0.00</w:t>
+              <w:t>50.00</w:t>
             </w:r>
           </w:p>
         </w:tc>
@@ -3200,7 +3240,7 @@
                 <w:b w:val="0"/>
                 <w:sz w:val="20"/>
               </w:rPr>
-              <w:t>12.22</w:t>
+              <w:t>12.86</w:t>
             </w:r>
           </w:p>
         </w:tc>
@@ -3238,7 +3278,7 @@
                 <w:b w:val="0"/>
                 <w:sz w:val="20"/>
               </w:rPr>
-              <w:t>3.64</w:t>
+              <w:t>3.83</w:t>
             </w:r>
           </w:p>
         </w:tc>

</xml_diff>